<commit_message>
Updated file with three more unit tests.
</commit_message>
<xml_diff>
--- a/Unit Testing.docx
+++ b/Unit Testing.docx
@@ -722,8 +722,600 @@
     <w:p/>
     <w:p/>
     <w:p>
-      <w:r>
+      <w:pPr>
+        <w:rPr>
+          <w:b/>
+          <w:bCs/>
+        </w:rPr>
+      </w:pPr>
+      <w:r>
+        <w:rPr>
+          <w:b/>
+          <w:bCs/>
+        </w:rPr>
         <w:lastRenderedPageBreak/>
+        <w:t>Unit Test: Add Food Item</w:t>
+      </w:r>
+    </w:p>
+    <w:p>
+      <w:r>
+        <w:t xml:space="preserve">The screenshots below </w:t>
+      </w:r>
+      <w:r>
+        <w:t>shows a unit test verifying that a food item can be added successfully to a patient's record. The test simulates entering valid input (such as the food name, calories, and portion size) and checks that the item is added without errors.</w:t>
+      </w:r>
+    </w:p>
+    <w:p>
+      <w:pPr>
+        <w:rPr>
+          <w:b/>
+          <w:bCs/>
+        </w:rPr>
+      </w:pPr>
+    </w:p>
+    <w:p>
+      <w:r>
+        <w:rPr>
+          <w:noProof/>
+        </w:rPr>
+        <w:drawing>
+          <wp:anchor distT="0" distB="0" distL="114300" distR="114300" simplePos="0" relativeHeight="251663360" behindDoc="1" locked="0" layoutInCell="1" allowOverlap="1" wp14:anchorId="4419A22A" wp14:editId="4B3EAC22">
+            <wp:simplePos x="0" y="0"/>
+            <wp:positionH relativeFrom="column">
+              <wp:posOffset>3139019</wp:posOffset>
+            </wp:positionH>
+            <wp:positionV relativeFrom="paragraph">
+              <wp:posOffset>60307</wp:posOffset>
+            </wp:positionV>
+            <wp:extent cx="2510790" cy="5078095"/>
+            <wp:effectExtent l="0" t="0" r="3810" b="1905"/>
+            <wp:wrapTight wrapText="bothSides">
+              <wp:wrapPolygon edited="0">
+                <wp:start x="0" y="0"/>
+                <wp:lineTo x="0" y="21554"/>
+                <wp:lineTo x="21524" y="21554"/>
+                <wp:lineTo x="21524" y="0"/>
+                <wp:lineTo x="0" y="0"/>
+              </wp:wrapPolygon>
+            </wp:wrapTight>
+            <wp:docPr id="1417904961" name="Picture 6" descr="A screenshot of a phone&#10;&#10;Description automatically generated"/>
+            <wp:cNvGraphicFramePr>
+              <a:graphicFrameLocks xmlns:a="http://schemas.openxmlformats.org/drawingml/2006/main" noChangeAspect="1"/>
+            </wp:cNvGraphicFramePr>
+            <a:graphic xmlns:a="http://schemas.openxmlformats.org/drawingml/2006/main">
+              <a:graphicData uri="http://schemas.openxmlformats.org/drawingml/2006/picture">
+                <pic:pic xmlns:pic="http://schemas.openxmlformats.org/drawingml/2006/picture">
+                  <pic:nvPicPr>
+                    <pic:cNvPr id="1417904961" name="Picture 6" descr="A screenshot of a phone&#10;&#10;Description automatically generated"/>
+                    <pic:cNvPicPr/>
+                  </pic:nvPicPr>
+                  <pic:blipFill>
+                    <a:blip r:embed="rId8">
+                      <a:extLst>
+                        <a:ext uri="{28A0092B-C50C-407E-A947-70E740481C1C}">
+                          <a14:useLocalDpi xmlns:a14="http://schemas.microsoft.com/office/drawing/2010/main" val="0"/>
+                        </a:ext>
+                      </a:extLst>
+                    </a:blip>
+                    <a:stretch>
+                      <a:fillRect/>
+                    </a:stretch>
+                  </pic:blipFill>
+                  <pic:spPr>
+                    <a:xfrm>
+                      <a:off x="0" y="0"/>
+                      <a:ext cx="2510790" cy="5078095"/>
+                    </a:xfrm>
+                    <a:prstGeom prst="rect">
+                      <a:avLst/>
+                    </a:prstGeom>
+                  </pic:spPr>
+                </pic:pic>
+              </a:graphicData>
+            </a:graphic>
+            <wp14:sizeRelH relativeFrom="page">
+              <wp14:pctWidth>0</wp14:pctWidth>
+            </wp14:sizeRelH>
+            <wp14:sizeRelV relativeFrom="page">
+              <wp14:pctHeight>0</wp14:pctHeight>
+            </wp14:sizeRelV>
+          </wp:anchor>
+        </w:drawing>
+      </w:r>
+      <w:r>
+        <w:rPr>
+          <w:noProof/>
+        </w:rPr>
+        <w:drawing>
+          <wp:anchor distT="0" distB="0" distL="114300" distR="114300" simplePos="0" relativeHeight="251662336" behindDoc="1" locked="0" layoutInCell="1" allowOverlap="1" wp14:anchorId="1FDBD97E" wp14:editId="63AA6BA0">
+            <wp:simplePos x="0" y="0"/>
+            <wp:positionH relativeFrom="column">
+              <wp:posOffset>250825</wp:posOffset>
+            </wp:positionH>
+            <wp:positionV relativeFrom="paragraph">
+              <wp:posOffset>63187</wp:posOffset>
+            </wp:positionV>
+            <wp:extent cx="2398395" cy="5078095"/>
+            <wp:effectExtent l="0" t="0" r="1905" b="1905"/>
+            <wp:wrapTight wrapText="bothSides">
+              <wp:wrapPolygon edited="0">
+                <wp:start x="0" y="0"/>
+                <wp:lineTo x="0" y="21554"/>
+                <wp:lineTo x="21503" y="21554"/>
+                <wp:lineTo x="21503" y="0"/>
+                <wp:lineTo x="0" y="0"/>
+              </wp:wrapPolygon>
+            </wp:wrapTight>
+            <wp:docPr id="1346850226" name="Picture 5"/>
+            <wp:cNvGraphicFramePr>
+              <a:graphicFrameLocks xmlns:a="http://schemas.openxmlformats.org/drawingml/2006/main" noChangeAspect="1"/>
+            </wp:cNvGraphicFramePr>
+            <a:graphic xmlns:a="http://schemas.openxmlformats.org/drawingml/2006/main">
+              <a:graphicData uri="http://schemas.openxmlformats.org/drawingml/2006/picture">
+                <pic:pic xmlns:pic="http://schemas.openxmlformats.org/drawingml/2006/picture">
+                  <pic:nvPicPr>
+                    <pic:cNvPr id="1346850226" name="Picture 1346850226"/>
+                    <pic:cNvPicPr/>
+                  </pic:nvPicPr>
+                  <pic:blipFill>
+                    <a:blip r:embed="rId9">
+                      <a:extLst>
+                        <a:ext uri="{28A0092B-C50C-407E-A947-70E740481C1C}">
+                          <a14:useLocalDpi xmlns:a14="http://schemas.microsoft.com/office/drawing/2010/main" val="0"/>
+                        </a:ext>
+                      </a:extLst>
+                    </a:blip>
+                    <a:stretch>
+                      <a:fillRect/>
+                    </a:stretch>
+                  </pic:blipFill>
+                  <pic:spPr>
+                    <a:xfrm>
+                      <a:off x="0" y="0"/>
+                      <a:ext cx="2398395" cy="5078095"/>
+                    </a:xfrm>
+                    <a:prstGeom prst="rect">
+                      <a:avLst/>
+                    </a:prstGeom>
+                  </pic:spPr>
+                </pic:pic>
+              </a:graphicData>
+            </a:graphic>
+            <wp14:sizeRelH relativeFrom="page">
+              <wp14:pctWidth>0</wp14:pctWidth>
+            </wp14:sizeRelH>
+            <wp14:sizeRelV relativeFrom="page">
+              <wp14:pctHeight>0</wp14:pctHeight>
+            </wp14:sizeRelV>
+          </wp:anchor>
+        </w:drawing>
+      </w:r>
+    </w:p>
+    <w:p/>
+    <w:p/>
+    <w:p/>
+    <w:p/>
+    <w:p/>
+    <w:p/>
+    <w:p/>
+    <w:p/>
+    <w:p/>
+    <w:p/>
+    <w:p/>
+    <w:p/>
+    <w:p/>
+    <w:p/>
+    <w:p/>
+    <w:p/>
+    <w:p/>
+    <w:p/>
+    <w:p/>
+    <w:p/>
+    <w:p/>
+    <w:p/>
+    <w:p/>
+    <w:p/>
+    <w:p/>
+    <w:p/>
+    <w:p/>
+    <w:p>
+      <w:r>
+        <w:fldChar w:fldCharType="begin"/>
+      </w:r>
+      <w:r>
+        <w:instrText xml:space="preserve"> INCLUDEPICTURE "https://mail.google.com/mail/u/0?ui=2&amp;ik=a2945fd497&amp;attid=0.3&amp;permmsgid=msg-f:1835862231115370353&amp;th=197a4af8ee300f71&amp;view=fimg&amp;fur=ip&amp;permmsgid=msg-f:1835862231115370353&amp;sz=s0-l75-ft&amp;attbid=ANGjdJ9rcRVbNwLw4yI74VSz7Gexq3KwOMZDbPSqFe7L47iNiFokRQTz6FxmbES4xmDS9xpnDpf8VrRiriRrYiewbKV5efBorsVpHUqHurovrl2jE7bE1NuXxuf591U&amp;disp=emb&amp;realattid=ii_mcb9t0ar2&amp;zw" \* MERGEFORMATINET </w:instrText>
+      </w:r>
+      <w:r>
+        <w:fldChar w:fldCharType="separate"/>
+      </w:r>
+      <w:r>
+        <w:fldChar w:fldCharType="end"/>
+      </w:r>
+    </w:p>
+    <w:p>
+      <w:pPr>
+        <w:rPr>
+          <w:b/>
+          <w:bCs/>
+        </w:rPr>
+      </w:pPr>
+      <w:r>
+        <w:rPr>
+          <w:b/>
+          <w:bCs/>
+        </w:rPr>
+        <w:t>What the Screenshot Shows</w:t>
+      </w:r>
+    </w:p>
+    <w:p>
+      <w:r>
+        <w:t>This screenshot highlights a test that checks whether the app correctly adds a food item to a patient’s record. It shows that the input form works as expected — valid entries are accepted, and missing or incorrect values are properly handled. It also confirms that the food data gets saved in the system, either in Firestore or locally.</w:t>
+      </w:r>
+    </w:p>
+    <w:p>
+      <w:r>
+        <w:t>This directly supports the user story:</w:t>
+      </w:r>
+      <w:r>
+        <w:br/>
+      </w:r>
+      <w:r>
+        <w:rPr>
+          <w:i/>
+          <w:iCs/>
+        </w:rPr>
+        <w:t>“As a student, I want to log food items so I can track a patient’s nutrition over time.”</w:t>
+      </w:r>
+    </w:p>
+    <w:p/>
+    <w:p>
+      <w:pPr>
+        <w:rPr>
+          <w:b/>
+          <w:bCs/>
+        </w:rPr>
+      </w:pPr>
+      <w:r>
+        <w:rPr>
+          <w:b/>
+          <w:bCs/>
+        </w:rPr>
+        <w:t>Why It Matters</w:t>
+      </w:r>
+    </w:p>
+    <w:p>
+      <w:r>
+        <w:t>Adding food correctly is essential for the app to function as intended. If the data isn’t saved or is entered incorrectly, nutrient analysis and reporting features would be unreliable. This test helps ensure the system remains dependable, especially as new features or changes are made in future updates.</w:t>
+      </w:r>
+    </w:p>
+    <w:p>
+      <w:pPr>
+        <w:rPr>
+          <w:b/>
+          <w:bCs/>
+        </w:rPr>
+      </w:pPr>
+      <w:r>
+        <w:rPr>
+          <w:b/>
+          <w:bCs/>
+        </w:rPr>
+        <w:lastRenderedPageBreak/>
+        <w:t>What the Screenshot Shows</w:t>
+      </w:r>
+    </w:p>
+    <w:p>
+      <w:r>
+        <w:t>This screenshot demonstrates a test for updating a patient’s daily calorie goal. It checks that when a new goal is entered (e.g. increasing from 1800 to 2200 kcal), the change is processed correctly and saved. The test ensures that the input is valid, the update is accepted, and the new goal is reflected in the system.</w:t>
+      </w:r>
+    </w:p>
+    <w:p>
+      <w:r>
+        <w:t>This supports the user story:</w:t>
+      </w:r>
+      <w:r>
+        <w:br/>
+      </w:r>
+      <w:r>
+        <w:rPr>
+          <w:i/>
+          <w:iCs/>
+        </w:rPr>
+        <w:t>“As a student, I want to adjust a patient’s calorie goal so I can tailor their nutrition plan more accurately.”</w:t>
+      </w:r>
+    </w:p>
+    <w:p/>
+    <w:p>
+      <w:pPr>
+        <w:rPr>
+          <w:b/>
+          <w:bCs/>
+        </w:rPr>
+      </w:pPr>
+      <w:r>
+        <w:rPr>
+          <w:b/>
+          <w:bCs/>
+        </w:rPr>
+        <w:t>Why It Matters</w:t>
+      </w:r>
+    </w:p>
+    <w:p>
+      <w:r>
+        <w:t>The ability to change a calorie goal is important for ongoing patient management. A reliable update system ensures that dietary plans stay aligned with the patient’s needs. This test helps confirm that changes are saved and used in future calculations, which supports accurate nutrient tracking and better recommendations.</w:t>
+      </w:r>
+    </w:p>
+    <w:p/>
+    <w:p>
+      <w:r>
+        <w:rPr>
+          <w:noProof/>
+        </w:rPr>
+        <w:drawing>
+          <wp:anchor distT="0" distB="0" distL="114300" distR="114300" simplePos="0" relativeHeight="251665408" behindDoc="1" locked="0" layoutInCell="1" allowOverlap="1" wp14:anchorId="689015FF" wp14:editId="75C82DB7">
+            <wp:simplePos x="0" y="0"/>
+            <wp:positionH relativeFrom="column">
+              <wp:posOffset>3113405</wp:posOffset>
+            </wp:positionH>
+            <wp:positionV relativeFrom="paragraph">
+              <wp:posOffset>141605</wp:posOffset>
+            </wp:positionV>
+            <wp:extent cx="2588260" cy="5539105"/>
+            <wp:effectExtent l="0" t="0" r="2540" b="0"/>
+            <wp:wrapTight wrapText="bothSides">
+              <wp:wrapPolygon edited="0">
+                <wp:start x="0" y="0"/>
+                <wp:lineTo x="0" y="21543"/>
+                <wp:lineTo x="21515" y="21543"/>
+                <wp:lineTo x="21515" y="0"/>
+                <wp:lineTo x="0" y="0"/>
+              </wp:wrapPolygon>
+            </wp:wrapTight>
+            <wp:docPr id="1979742135" name="Picture 9" descr="A screenshot of a calorie counter&#10;&#10;Description automatically generated"/>
+            <wp:cNvGraphicFramePr>
+              <a:graphicFrameLocks xmlns:a="http://schemas.openxmlformats.org/drawingml/2006/main" noChangeAspect="1"/>
+            </wp:cNvGraphicFramePr>
+            <a:graphic xmlns:a="http://schemas.openxmlformats.org/drawingml/2006/main">
+              <a:graphicData uri="http://schemas.openxmlformats.org/drawingml/2006/picture">
+                <pic:pic xmlns:pic="http://schemas.openxmlformats.org/drawingml/2006/picture">
+                  <pic:nvPicPr>
+                    <pic:cNvPr id="1979742135" name="Picture 9" descr="A screenshot of a calorie counter&#10;&#10;Description automatically generated"/>
+                    <pic:cNvPicPr/>
+                  </pic:nvPicPr>
+                  <pic:blipFill>
+                    <a:blip r:embed="rId10">
+                      <a:extLst>
+                        <a:ext uri="{28A0092B-C50C-407E-A947-70E740481C1C}">
+                          <a14:useLocalDpi xmlns:a14="http://schemas.microsoft.com/office/drawing/2010/main" val="0"/>
+                        </a:ext>
+                      </a:extLst>
+                    </a:blip>
+                    <a:stretch>
+                      <a:fillRect/>
+                    </a:stretch>
+                  </pic:blipFill>
+                  <pic:spPr>
+                    <a:xfrm>
+                      <a:off x="0" y="0"/>
+                      <a:ext cx="2588260" cy="5539105"/>
+                    </a:xfrm>
+                    <a:prstGeom prst="rect">
+                      <a:avLst/>
+                    </a:prstGeom>
+                  </pic:spPr>
+                </pic:pic>
+              </a:graphicData>
+            </a:graphic>
+            <wp14:sizeRelH relativeFrom="page">
+              <wp14:pctWidth>0</wp14:pctWidth>
+            </wp14:sizeRelH>
+            <wp14:sizeRelV relativeFrom="page">
+              <wp14:pctHeight>0</wp14:pctHeight>
+            </wp14:sizeRelV>
+          </wp:anchor>
+        </w:drawing>
+      </w:r>
+      <w:r>
+        <w:rPr>
+          <w:noProof/>
+        </w:rPr>
+        <w:drawing>
+          <wp:anchor distT="0" distB="0" distL="114300" distR="114300" simplePos="0" relativeHeight="251664384" behindDoc="1" locked="0" layoutInCell="1" allowOverlap="1" wp14:anchorId="120F8120" wp14:editId="65771E47">
+            <wp:simplePos x="0" y="0"/>
+            <wp:positionH relativeFrom="column">
+              <wp:posOffset>16510</wp:posOffset>
+            </wp:positionH>
+            <wp:positionV relativeFrom="paragraph">
+              <wp:posOffset>146685</wp:posOffset>
+            </wp:positionV>
+            <wp:extent cx="2669540" cy="5623560"/>
+            <wp:effectExtent l="0" t="0" r="0" b="2540"/>
+            <wp:wrapTight wrapText="bothSides">
+              <wp:wrapPolygon edited="0">
+                <wp:start x="0" y="0"/>
+                <wp:lineTo x="0" y="21561"/>
+                <wp:lineTo x="21477" y="21561"/>
+                <wp:lineTo x="21477" y="0"/>
+                <wp:lineTo x="0" y="0"/>
+              </wp:wrapPolygon>
+            </wp:wrapTight>
+            <wp:docPr id="1978474466" name="Picture 8"/>
+            <wp:cNvGraphicFramePr>
+              <a:graphicFrameLocks xmlns:a="http://schemas.openxmlformats.org/drawingml/2006/main" noChangeAspect="1"/>
+            </wp:cNvGraphicFramePr>
+            <a:graphic xmlns:a="http://schemas.openxmlformats.org/drawingml/2006/main">
+              <a:graphicData uri="http://schemas.openxmlformats.org/drawingml/2006/picture">
+                <pic:pic xmlns:pic="http://schemas.openxmlformats.org/drawingml/2006/picture">
+                  <pic:nvPicPr>
+                    <pic:cNvPr id="1978474466" name="Picture 8"/>
+                    <pic:cNvPicPr/>
+                  </pic:nvPicPr>
+                  <pic:blipFill>
+                    <a:blip r:embed="rId11">
+                      <a:extLst>
+                        <a:ext uri="{28A0092B-C50C-407E-A947-70E740481C1C}">
+                          <a14:useLocalDpi xmlns:a14="http://schemas.microsoft.com/office/drawing/2010/main" val="0"/>
+                        </a:ext>
+                      </a:extLst>
+                    </a:blip>
+                    <a:stretch>
+                      <a:fillRect/>
+                    </a:stretch>
+                  </pic:blipFill>
+                  <pic:spPr>
+                    <a:xfrm>
+                      <a:off x="0" y="0"/>
+                      <a:ext cx="2669540" cy="5623560"/>
+                    </a:xfrm>
+                    <a:prstGeom prst="rect">
+                      <a:avLst/>
+                    </a:prstGeom>
+                  </pic:spPr>
+                </pic:pic>
+              </a:graphicData>
+            </a:graphic>
+            <wp14:sizeRelH relativeFrom="page">
+              <wp14:pctWidth>0</wp14:pctWidth>
+            </wp14:sizeRelH>
+            <wp14:sizeRelV relativeFrom="page">
+              <wp14:pctHeight>0</wp14:pctHeight>
+            </wp14:sizeRelV>
+          </wp:anchor>
+        </w:drawing>
+      </w:r>
+    </w:p>
+    <w:p>
+      <w:pPr>
+        <w:rPr>
+          <w:color w:val="000000"/>
+        </w:rPr>
+      </w:pPr>
+      <w:r>
+        <w:rPr>
+          <w:rStyle w:val="highlights"/>
+          <w:color w:val="000000"/>
+        </w:rPr>
+        <w:lastRenderedPageBreak/>
+        <w:t>This screenshot shows a unit test that checks how the app responds when a user tries to submit the form without entering a valid name. It confirms that if the name field is left empty or filled incorrectly, the app reacts properly by showing an error message — “Please enter your name” — and highlighting the field with a red border. This supports the user story:</w:t>
+      </w:r>
+      <w:r>
+        <w:rPr>
+          <w:rStyle w:val="highlights"/>
+          <w:color w:val="000000"/>
+        </w:rPr>
+        <w:t xml:space="preserve"> </w:t>
+      </w:r>
+      <w:r>
+        <w:rPr>
+          <w:rStyle w:val="highlights"/>
+          <w:color w:val="000000"/>
+        </w:rPr>
+        <w:t>“As a student, I want to make sure that all the information I need is entered correctly so that patient records are accurate and complete.”</w:t>
+      </w:r>
+    </w:p>
+    <w:p/>
+    <w:p/>
+    <w:p>
+      <w:r>
+        <w:drawing>
+          <wp:anchor distT="0" distB="0" distL="114300" distR="114300" simplePos="0" relativeHeight="251666432" behindDoc="1" locked="0" layoutInCell="1" allowOverlap="1" wp14:anchorId="416CB770" wp14:editId="6336AE40">
+            <wp:simplePos x="0" y="0"/>
+            <wp:positionH relativeFrom="column">
+              <wp:posOffset>1510748</wp:posOffset>
+            </wp:positionH>
+            <wp:positionV relativeFrom="paragraph">
+              <wp:posOffset>61789</wp:posOffset>
+            </wp:positionV>
+            <wp:extent cx="2633345" cy="5575935"/>
+            <wp:effectExtent l="0" t="0" r="0" b="0"/>
+            <wp:wrapTight wrapText="bothSides">
+              <wp:wrapPolygon edited="0">
+                <wp:start x="0" y="0"/>
+                <wp:lineTo x="0" y="21548"/>
+                <wp:lineTo x="21459" y="21548"/>
+                <wp:lineTo x="21459" y="0"/>
+                <wp:lineTo x="0" y="0"/>
+              </wp:wrapPolygon>
+            </wp:wrapTight>
+            <wp:docPr id="1771479214" name="Picture 1"/>
+            <wp:cNvGraphicFramePr>
+              <a:graphicFrameLocks xmlns:a="http://schemas.openxmlformats.org/drawingml/2006/main" noChangeAspect="1"/>
+            </wp:cNvGraphicFramePr>
+            <a:graphic xmlns:a="http://schemas.openxmlformats.org/drawingml/2006/main">
+              <a:graphicData uri="http://schemas.openxmlformats.org/drawingml/2006/picture">
+                <pic:pic xmlns:pic="http://schemas.openxmlformats.org/drawingml/2006/picture">
+                  <pic:nvPicPr>
+                    <pic:cNvPr id="1771479214" name=""/>
+                    <pic:cNvPicPr/>
+                  </pic:nvPicPr>
+                  <pic:blipFill>
+                    <a:blip r:embed="rId12">
+                      <a:extLst>
+                        <a:ext uri="{28A0092B-C50C-407E-A947-70E740481C1C}">
+                          <a14:useLocalDpi xmlns:a14="http://schemas.microsoft.com/office/drawing/2010/main" val="0"/>
+                        </a:ext>
+                      </a:extLst>
+                    </a:blip>
+                    <a:stretch>
+                      <a:fillRect/>
+                    </a:stretch>
+                  </pic:blipFill>
+                  <pic:spPr>
+                    <a:xfrm>
+                      <a:off x="0" y="0"/>
+                      <a:ext cx="2633345" cy="5575935"/>
+                    </a:xfrm>
+                    <a:prstGeom prst="rect">
+                      <a:avLst/>
+                    </a:prstGeom>
+                  </pic:spPr>
+                </pic:pic>
+              </a:graphicData>
+            </a:graphic>
+            <wp14:sizeRelH relativeFrom="page">
+              <wp14:pctWidth>0</wp14:pctWidth>
+            </wp14:sizeRelH>
+            <wp14:sizeRelV relativeFrom="page">
+              <wp14:pctHeight>0</wp14:pctHeight>
+            </wp14:sizeRelV>
+          </wp:anchor>
+        </w:drawing>
+      </w:r>
+    </w:p>
+    <w:p/>
+    <w:p/>
+    <w:p/>
+    <w:p/>
+    <w:p/>
+    <w:p/>
+    <w:p/>
+    <w:p/>
+    <w:p/>
+    <w:p/>
+    <w:p/>
+    <w:p/>
+    <w:p/>
+    <w:p/>
+    <w:p/>
+    <w:p/>
+    <w:p/>
+    <w:p/>
+    <w:p/>
+    <w:p/>
+    <w:p/>
+    <w:p/>
+    <w:p/>
+    <w:p/>
+    <w:p/>
+    <w:p/>
+    <w:p/>
+    <w:p/>
+    <w:p/>
+    <w:p/>
+    <w:p/>
+    <w:p/>
+    <w:p>
+      <w:r>
         <w:t>These screenshots are valuable because they show that both unit-level and functional logic have been properly built and tested.</w:t>
       </w:r>
       <w:r>
@@ -739,13 +1331,7 @@
         <w:t>Together, they highlight how inspection and testing work side by side to make the system more reliable and user-friendly.</w:t>
       </w:r>
     </w:p>
-    <w:p>
-      <w:pPr>
-        <w:rPr>
-          <w:lang w:val="en-US"/>
-        </w:rPr>
-      </w:pPr>
-    </w:p>
+    <w:p/>
     <w:sectPr>
       <w:pgSz w:w="11906" w:h="16838"/>
       <w:pgMar w:top="1440" w:right="1440" w:bottom="1440" w:left="1440" w:header="708" w:footer="708" w:gutter="0"/>
@@ -1184,6 +1770,11 @@
     <w:basedOn w:val="DefaultParagraphFont"/>
     <w:rsid w:val="00E45198"/>
   </w:style>
+  <w:style w:type="character" w:customStyle="1" w:styleId="highlights">
+    <w:name w:val="highlights"/>
+    <w:basedOn w:val="DefaultParagraphFont"/>
+    <w:rsid w:val="008E6D8C"/>
+  </w:style>
 </w:styles>
 </file>
 

</xml_diff>